<commit_message>
aymen: supervisor-side track notes, held inbox entries, learning agreement
WORKING-reducible-noise gains the reframing that epistemic/aleatoric and
reducible/irreducible are the same split at different rungs of the stack, so the
oracle-ladder and BNN directions stop looking like competing scopes.

HELD-inbox-entries carries HELD-01 (still gated on TASK-01) and HELD-02, released
2026-09-23 into his repo. Both deliberately live outside the student repo.
</commit_message>
<xml_diff>
--- a/Ayman/SMP_LA_Training_2026 (1) (1).docx
+++ b/Ayman/SMP_LA_Training_2026 (1) (1).docx
@@ -1826,6 +1826,16 @@
                 <w:lang w:val="en-GB" w:eastAsia="en-GB"/>
               </w:rPr>
             </w:pPr>
+            <w:r>
+              <w:rPr>
+                <w:rFonts w:ascii="Calibri" w:eastAsia="Times New Roman" w:hAnsi="Calibri" w:cs="Times New Roman"/>
+                <w:color w:val="000000"/>
+                <w:sz w:val="16"/>
+                <w:szCs w:val="16"/>
+                <w:lang w:val="en-GB" w:eastAsia="en-GB"/>
+              </w:rPr>
+              <w:t>Czech Technical University</w:t>
+            </w:r>
           </w:p>
         </w:tc>
         <w:tc>
@@ -1850,6 +1860,16 @@
                 <w:lang w:val="en-GB" w:eastAsia="en-GB"/>
               </w:rPr>
             </w:pPr>
+            <w:r>
+              <w:rPr>
+                <w:rFonts w:ascii="Calibri" w:eastAsia="Times New Roman" w:hAnsi="Calibri" w:cs="Times New Roman"/>
+                <w:color w:val="000000"/>
+                <w:sz w:val="16"/>
+                <w:szCs w:val="16"/>
+                <w:lang w:val="en-GB" w:eastAsia="en-GB"/>
+              </w:rPr>
+              <w:t>Computer Science</w:t>
+            </w:r>
           </w:p>
         </w:tc>
         <w:tc>
@@ -1901,6 +1921,16 @@
                 <w:lang w:val="en-GB" w:eastAsia="en-GB"/>
               </w:rPr>
             </w:pPr>
+            <w:r>
+              <w:rPr>
+                <w:rFonts w:ascii="Calibri" w:eastAsia="Times New Roman" w:hAnsi="Calibri" w:cs="Times New Roman"/>
+                <w:color w:val="000000"/>
+                <w:sz w:val="16"/>
+                <w:szCs w:val="16"/>
+                <w:lang w:val="en-GB" w:eastAsia="en-GB"/>
+              </w:rPr>
+              <w:t>Czech Republic</w:t>
+            </w:r>
           </w:p>
         </w:tc>
         <w:tc>
@@ -2013,7 +2043,7 @@
               </w:sdtPr>
               <w:sdtContent>
                 <w:r>
-                  <w:t>☐</w:t>
+                  <w:t>X</w:t>
                 </w:r>
               </w:sdtContent>
             </w:sdt>
@@ -2075,6 +2105,16 @@
                 <w:lang w:val="en-GB" w:eastAsia="en-GB"/>
               </w:rPr>
             </w:pPr>
+            <w:r>
+              <w:rPr>
+                <w:rFonts w:ascii="Calibri" w:eastAsia="Times New Roman" w:hAnsi="Calibri" w:cs="Times New Roman"/>
+                <w:color w:val="000000"/>
+                <w:sz w:val="16"/>
+                <w:szCs w:val="16"/>
+                <w:lang w:val="en-GB" w:eastAsia="en-GB"/>
+              </w:rPr>
+              <w:t>Vaclav Smidl, professor, smidlva1@cvut.cz</w:t>
+            </w:r>
           </w:p>
         </w:tc>
         <w:tc>
@@ -2100,6 +2140,16 @@
                 <w:lang w:val="en-GB" w:eastAsia="en-GB"/>
               </w:rPr>
             </w:pPr>
+            <w:r>
+              <w:rPr>
+                <w:rFonts w:ascii="Calibri" w:eastAsia="Times New Roman" w:hAnsi="Calibri" w:cs="Times New Roman"/>
+                <w:color w:val="000000"/>
+                <w:sz w:val="16"/>
+                <w:szCs w:val="16"/>
+                <w:lang w:val="en-GB" w:eastAsia="en-GB"/>
+              </w:rPr>
+              <w:t>Vaclav Smidl, professor, smidlva1@cvut.cz</w:t>
+            </w:r>
           </w:p>
         </w:tc>
       </w:tr>
@@ -2548,7 +2598,17 @@
                 <w:szCs w:val="16"/>
                 <w:lang w:val="en-GB"/>
               </w:rPr>
-              <w:t>Traineeship title: …</w:t>
+              <w:t>Traineeship title:</w:t>
+            </w:r>
+            <w:r>
+              <w:rPr>
+                <w:rFonts w:asciiTheme="minorHAnsi" w:eastAsiaTheme="minorHAnsi" w:hAnsiTheme="minorHAnsi" w:cs="Calibri"/>
+                <w:b/>
+                <w:sz w:val="16"/>
+                <w:szCs w:val="16"/>
+                <w:lang w:val="en-GB"/>
+              </w:rPr>
+              <w:t xml:space="preserve"> Master Student</w:t>
             </w:r>
           </w:p>
           <w:p>
@@ -2601,7 +2661,17 @@
                 <w:szCs w:val="16"/>
                 <w:lang w:val="en-GB"/>
               </w:rPr>
-              <w:t>Number of working hours per week: …</w:t>
+              <w:t>Number of working hours per week:</w:t>
+            </w:r>
+            <w:r>
+              <w:rPr>
+                <w:rFonts w:asciiTheme="minorHAnsi" w:eastAsiaTheme="minorHAnsi" w:hAnsiTheme="minorHAnsi" w:cs="Calibri"/>
+                <w:b/>
+                <w:sz w:val="16"/>
+                <w:szCs w:val="16"/>
+                <w:lang w:val="en-GB"/>
+              </w:rPr>
+              <w:t xml:space="preserve"> 40</w:t>
             </w:r>
           </w:p>
         </w:tc>
@@ -2665,6 +2735,15 @@
                 <w:lang w:val="en-GB"/>
               </w:rPr>
             </w:pPr>
+            <w:r>
+              <w:rPr>
+                <w:rFonts w:cs="Arial"/>
+                <w:sz w:val="16"/>
+                <w:szCs w:val="16"/>
+                <w:lang w:val="en-GB"/>
+              </w:rPr>
+              <w:t>Work on master thesis following the proposal</w:t>
+            </w:r>
           </w:p>
         </w:tc>
       </w:tr>
@@ -2726,6 +2805,7 @@
               </w:rPr>
               <w:t xml:space="preserve">: </w:t>
             </w:r>
+            <w:proofErr w:type="gramStart"/>
             <w:r>
               <w:rPr>
                 <w:rFonts w:cs="Calibri"/>
@@ -2742,8 +2822,9 @@
                 <w:szCs w:val="16"/>
                 <w:lang w:val="en-GB"/>
               </w:rPr>
-              <w:t>☐</w:t>
-            </w:r>
+              <w:t xml:space="preserve"> X</w:t>
+            </w:r>
+            <w:proofErr w:type="gramEnd"/>
             <w:r>
               <w:rPr>
                 <w:rFonts w:cs="Calibri"/>
@@ -3207,7 +3288,27 @@
                 <w:szCs w:val="16"/>
                 <w:lang w:val="en-GB" w:eastAsia="en-GB"/>
               </w:rPr>
-              <w:t xml:space="preserve">  in ________ [</w:t>
+              <w:t xml:space="preserve">  in </w:t>
+            </w:r>
+            <w:r>
+              <w:rPr>
+                <w:rFonts w:eastAsia="Times New Roman" w:cs="Times New Roman"/>
+                <w:color w:val="000000"/>
+                <w:sz w:val="16"/>
+                <w:szCs w:val="16"/>
+                <w:lang w:val="en-GB" w:eastAsia="en-GB"/>
+              </w:rPr>
+              <w:t>English</w:t>
+            </w:r>
+            <w:r>
+              <w:rPr>
+                <w:rFonts w:eastAsia="Times New Roman" w:cs="Times New Roman"/>
+                <w:color w:val="000000"/>
+                <w:sz w:val="16"/>
+                <w:szCs w:val="16"/>
+                <w:lang w:val="en-GB" w:eastAsia="en-GB"/>
+              </w:rPr>
+              <w:t xml:space="preserve"> [</w:t>
             </w:r>
             <w:r>
               <w:rPr>
@@ -3228,7 +3329,29 @@
                 <w:szCs w:val="16"/>
                 <w:lang w:val="en-GB" w:eastAsia="en-GB"/>
               </w:rPr>
-              <w:t xml:space="preserve">] that the trainee already has or agrees to acquire by the start of the mobility period is: </w:t>
+              <w:t xml:space="preserve">] that the trainee already has or agrees to acquire by the start of the mobility period </w:t>
+            </w:r>
+            <w:proofErr w:type="gramStart"/>
+            <w:r>
+              <w:rPr>
+                <w:rFonts w:eastAsia="Times New Roman" w:cs="Times New Roman"/>
+                <w:color w:val="000000"/>
+                <w:sz w:val="16"/>
+                <w:szCs w:val="16"/>
+                <w:lang w:val="en-GB" w:eastAsia="en-GB"/>
+              </w:rPr>
+              <w:t>is:</w:t>
+            </w:r>
+            <w:proofErr w:type="gramEnd"/>
+            <w:r>
+              <w:rPr>
+                <w:rFonts w:eastAsia="Times New Roman" w:cs="Times New Roman"/>
+                <w:color w:val="000000"/>
+                <w:sz w:val="16"/>
+                <w:szCs w:val="16"/>
+                <w:lang w:val="en-GB" w:eastAsia="en-GB"/>
+              </w:rPr>
+              <w:t xml:space="preserve"> </w:t>
             </w:r>
             <w:r>
               <w:rPr>
@@ -4728,7 +4851,6 @@
                       <w:szCs w:val="16"/>
                       <w:lang w:val="en-GB" w:eastAsia="en-GB"/>
                     </w:rPr>
-                    <w:lastRenderedPageBreak/>
                     <w:t>Record the traineeship in the trainee</w:t>
                   </w:r>
                   <w:r>
@@ -5537,7 +5659,7 @@
                     </w:sdtPr>
                     <w:sdtContent>
                       <w:r>
-                        <w:t>☐</w:t>
+                        <w:t>x</w:t>
                       </w:r>
                     </w:sdtContent>
                   </w:sdt>
@@ -5629,7 +5751,18 @@
                       <w:szCs w:val="16"/>
                       <w:lang w:val="en-GB" w:eastAsia="en-GB"/>
                     </w:rPr>
-                    <w:t>If yes, amount (EUR/month): ………..</w:t>
+                    <w:t xml:space="preserve">If yes, amount (EUR/month): </w:t>
+                  </w:r>
+                  <w:r>
+                    <w:rPr>
+                      <w:rFonts w:eastAsia="Times New Roman" w:cstheme="minorHAnsi"/>
+                      <w:bCs/>
+                      <w:color w:val="000000"/>
+                      <w:sz w:val="16"/>
+                      <w:szCs w:val="16"/>
+                      <w:lang w:val="en-GB" w:eastAsia="en-GB"/>
+                    </w:rPr>
+                    <w:t>500</w:t>
                   </w:r>
                 </w:p>
                 <w:p>
@@ -5923,7 +6056,7 @@
                     </w:sdtPr>
                     <w:sdtContent>
                       <w:r>
-                        <w:t>☐</w:t>
+                        <w:t>X</w:t>
                       </w:r>
                     </w:sdtContent>
                   </w:sdt>
@@ -6032,7 +6165,7 @@
                     </w:sdtPr>
                     <w:sdtContent>
                       <w:r>
-                        <w:t>☐</w:t>
+                        <w:t>X</w:t>
                       </w:r>
                     </w:sdtContent>
                   </w:sdt>
@@ -6074,7 +6207,7 @@
                     </w:sdtPr>
                     <w:sdtContent>
                       <w:r>
-                        <w:t>☐</w:t>
+                        <w:t>X</w:t>
                       </w:r>
                     </w:sdtContent>
                   </w:sdt>
@@ -6195,7 +6328,7 @@
                     </w:sdtPr>
                     <w:sdtContent>
                       <w:r>
-                        <w:t>☐</w:t>
+                        <w:t>X</w:t>
                       </w:r>
                     </w:sdtContent>
                   </w:sdt>
@@ -7867,6 +8000,16 @@
                 <w:lang w:val="en-GB" w:eastAsia="en-GB"/>
               </w:rPr>
             </w:pPr>
+            <w:r>
+              <w:rPr>
+                <w:rFonts w:eastAsia="Times New Roman" w:cstheme="minorHAnsi"/>
+                <w:color w:val="000000"/>
+                <w:sz w:val="16"/>
+                <w:szCs w:val="16"/>
+                <w:lang w:val="en-GB" w:eastAsia="en-GB"/>
+              </w:rPr>
+              <w:t>Vaclav Smidl</w:t>
+            </w:r>
           </w:p>
         </w:tc>
         <w:tc>
@@ -7889,6 +8032,18 @@
                 <w:lang w:val="en-GB" w:eastAsia="en-GB"/>
               </w:rPr>
             </w:pPr>
+            <w:hyperlink r:id="rId12" w:history="1">
+              <w:r>
+                <w:rPr>
+                  <w:rStyle w:val="Hyperlink"/>
+                  <w:rFonts w:eastAsia="Times New Roman" w:cstheme="minorHAnsi"/>
+                  <w:sz w:val="16"/>
+                  <w:szCs w:val="16"/>
+                  <w:lang w:val="en-GB" w:eastAsia="en-GB"/>
+                </w:rPr>
+                <w:t>Smidlva1@cvut.cz</w:t>
+              </w:r>
+            </w:hyperlink>
           </w:p>
         </w:tc>
         <w:tc>
@@ -7912,6 +8067,16 @@
                 <w:lang w:val="en-GB" w:eastAsia="en-GB"/>
               </w:rPr>
             </w:pPr>
+            <w:r>
+              <w:rPr>
+                <w:rFonts w:eastAsia="Times New Roman" w:cstheme="minorHAnsi"/>
+                <w:color w:val="000000"/>
+                <w:sz w:val="16"/>
+                <w:szCs w:val="16"/>
+                <w:lang w:val="en-GB" w:eastAsia="en-GB"/>
+              </w:rPr>
+              <w:t>Professor</w:t>
+            </w:r>
           </w:p>
         </w:tc>
         <w:tc>
@@ -7936,6 +8101,16 @@
                 <w:lang w:val="en-GB" w:eastAsia="en-GB"/>
               </w:rPr>
             </w:pPr>
+            <w:r>
+              <w:rPr>
+                <w:rFonts w:eastAsia="Times New Roman" w:cstheme="minorHAnsi"/>
+                <w:color w:val="000000"/>
+                <w:sz w:val="16"/>
+                <w:szCs w:val="16"/>
+                <w:lang w:val="en-GB" w:eastAsia="en-GB"/>
+              </w:rPr>
+              <w:t>11.8.2026</w:t>
+            </w:r>
           </w:p>
         </w:tc>
         <w:tc>
@@ -7963,6 +8138,59 @@
                 <w:lang w:val="en-GB" w:eastAsia="en-GB"/>
               </w:rPr>
             </w:pPr>
+            <w:r>
+              <w:rPr>
+                <w:rFonts w:eastAsia="Times New Roman" w:cstheme="minorHAnsi"/>
+                <w:b/>
+                <w:bCs/>
+                <w:noProof/>
+                <w:color w:val="000000"/>
+                <w:sz w:val="16"/>
+                <w:szCs w:val="16"/>
+                <w:lang w:val="en-GB" w:eastAsia="en-GB"/>
+              </w:rPr>
+              <w:drawing>
+                <wp:inline distT="0" distB="0" distL="0" distR="0" wp14:anchorId="0F9FDA74" wp14:editId="2875C20A">
+                  <wp:extent cx="549762" cy="358109"/>
+                  <wp:effectExtent l="0" t="0" r="0" b="0"/>
+                  <wp:docPr id="2092474768" name="Picture 4"/>
+                  <wp:cNvGraphicFramePr>
+                    <a:graphicFrameLocks xmlns:a="http://schemas.openxmlformats.org/drawingml/2006/main" noChangeAspect="1"/>
+                  </wp:cNvGraphicFramePr>
+                  <a:graphic xmlns:a="http://schemas.openxmlformats.org/drawingml/2006/main">
+                    <a:graphicData uri="http://schemas.openxmlformats.org/drawingml/2006/picture">
+                      <pic:pic xmlns:pic="http://schemas.openxmlformats.org/drawingml/2006/picture">
+                        <pic:nvPicPr>
+                          <pic:cNvPr id="2092474768" name="Picture 2092474768"/>
+                          <pic:cNvPicPr/>
+                        </pic:nvPicPr>
+                        <pic:blipFill>
+                          <a:blip r:embed="rId13" cstate="print">
+                            <a:extLst>
+                              <a:ext uri="{28A0092B-C50C-407E-A947-70E740481C1C}">
+                                <a14:useLocalDpi xmlns:a14="http://schemas.microsoft.com/office/drawing/2010/main" val="0"/>
+                              </a:ext>
+                            </a:extLst>
+                          </a:blip>
+                          <a:stretch>
+                            <a:fillRect/>
+                          </a:stretch>
+                        </pic:blipFill>
+                        <pic:spPr>
+                          <a:xfrm>
+                            <a:off x="0" y="0"/>
+                            <a:ext cx="575572" cy="374921"/>
+                          </a:xfrm>
+                          <a:prstGeom prst="rect">
+                            <a:avLst/>
+                          </a:prstGeom>
+                        </pic:spPr>
+                      </pic:pic>
+                    </a:graphicData>
+                  </a:graphic>
+                </wp:inline>
+              </w:drawing>
+            </w:r>
           </w:p>
         </w:tc>
       </w:tr>
@@ -8498,7 +8726,17 @@
                 <w:szCs w:val="16"/>
                 <w:lang w:val="en-GB"/>
               </w:rPr>
-              <w:t>Traineeship title: …</w:t>
+              <w:t>Traineeship title:</w:t>
+            </w:r>
+            <w:r>
+              <w:rPr>
+                <w:rFonts w:asciiTheme="minorHAnsi" w:eastAsiaTheme="minorHAnsi" w:hAnsiTheme="minorHAnsi" w:cs="Calibri"/>
+                <w:b/>
+                <w:sz w:val="16"/>
+                <w:szCs w:val="16"/>
+                <w:lang w:val="en-GB"/>
+              </w:rPr>
+              <w:t xml:space="preserve"> Master Student</w:t>
             </w:r>
           </w:p>
           <w:p>
@@ -8552,7 +8790,17 @@
                 <w:szCs w:val="16"/>
                 <w:lang w:val="en-GB"/>
               </w:rPr>
-              <w:t>Number of working hours per week: …</w:t>
+              <w:t>Number of working hours per week:</w:t>
+            </w:r>
+            <w:r>
+              <w:rPr>
+                <w:rFonts w:asciiTheme="minorHAnsi" w:eastAsiaTheme="minorHAnsi" w:hAnsiTheme="minorHAnsi" w:cs="Calibri"/>
+                <w:b/>
+                <w:sz w:val="16"/>
+                <w:szCs w:val="16"/>
+                <w:lang w:val="en-GB"/>
+              </w:rPr>
+              <w:t xml:space="preserve"> 40</w:t>
             </w:r>
           </w:p>
         </w:tc>
@@ -8621,6 +8869,15 @@
                 <w:lang w:val="en-GB"/>
               </w:rPr>
             </w:pPr>
+            <w:r>
+              <w:rPr>
+                <w:rFonts w:cs="Arial"/>
+                <w:sz w:val="16"/>
+                <w:szCs w:val="16"/>
+                <w:lang w:val="en-GB"/>
+              </w:rPr>
+              <w:t>Work on master thesis following the thesis proposal.</w:t>
+            </w:r>
           </w:p>
           <w:p>
             <w:pPr>
@@ -8754,6 +9011,37 @@
                 <w:lang w:val="en-GB"/>
               </w:rPr>
             </w:pPr>
+            <w:r>
+              <w:rPr>
+                <w:rFonts w:cs="Arial"/>
+                <w:sz w:val="16"/>
+                <w:szCs w:val="16"/>
+                <w:lang w:val="en-GB"/>
+              </w:rPr>
+              <w:t xml:space="preserve">Knowledge: active learning and sequential experimental design, uncertainty quantification including the reducible/irreducible split, structure and limits of </w:t>
+            </w:r>
+          </w:p>
+          <w:p>
+            <w:pPr>
+              <w:widowControl w:val="0"/>
+              <w:spacing w:before="80" w:after="80"/>
+              <w:ind w:right="-992"/>
+              <w:rPr>
+                <w:rFonts w:cs="Arial"/>
+                <w:sz w:val="16"/>
+                <w:szCs w:val="16"/>
+                <w:lang w:val="en-GB"/>
+              </w:rPr>
+            </w:pPr>
+            <w:r>
+              <w:rPr>
+                <w:rFonts w:cs="Arial"/>
+                <w:sz w:val="16"/>
+                <w:szCs w:val="16"/>
+                <w:lang w:val="en-GB"/>
+              </w:rPr>
+              <w:t>experimental chemistry data. Skills: controlled computational experiments, statistical evaluation with proper replication, HPC batch scheduling, version-controlled reproducible practice, scientific writing. Competences: formulating a question and designing experiments that can falsify it, critically assessing published claims — specifically recognising when a negative result is implementation rather than phenomenon, which is the actual skill this project teaches — and independent time management.</w:t>
+            </w:r>
           </w:p>
           <w:p>
             <w:pPr>
@@ -8816,12 +9104,22 @@
               <w:ind w:left="-6" w:firstLine="6"/>
               <w:rPr>
                 <w:rFonts w:cs="Calibri"/>
-                <w:b/>
+                <w:bCs/>
                 <w:sz w:val="16"/>
                 <w:szCs w:val="16"/>
                 <w:lang w:val="en-GB"/>
               </w:rPr>
             </w:pPr>
+            <w:r>
+              <w:rPr>
+                <w:rFonts w:cs="Calibri"/>
+                <w:bCs/>
+                <w:sz w:val="16"/>
+                <w:szCs w:val="16"/>
+                <w:lang w:val="en-GB"/>
+              </w:rPr>
+              <w:t>Weekly supervision, everything under version control and continuously visible, a written log, and a formal mid-term review at month 3 where the corrected baseline and protocol are assessed and the rest of the plan confirmed or adjusted.</w:t>
+            </w:r>
           </w:p>
           <w:p>
             <w:pPr>
@@ -8884,12 +9182,112 @@
               <w:ind w:right="-993"/>
               <w:rPr>
                 <w:rFonts w:cs="Calibri"/>
-                <w:b/>
+                <w:bCs/>
                 <w:sz w:val="16"/>
                 <w:szCs w:val="16"/>
                 <w:lang w:val="en-GB"/>
               </w:rPr>
             </w:pPr>
+            <w:r>
+              <w:rPr>
+                <w:rFonts w:cs="Calibri"/>
+                <w:bCs/>
+                <w:sz w:val="16"/>
+                <w:szCs w:val="16"/>
+                <w:lang w:val="en-GB"/>
+              </w:rPr>
+              <w:t xml:space="preserve">Based </w:t>
+            </w:r>
+            <w:r>
+              <w:rPr>
+                <w:rFonts w:cs="Calibri"/>
+                <w:bCs/>
+                <w:sz w:val="16"/>
+                <w:szCs w:val="16"/>
+                <w:lang w:val="en-GB"/>
+              </w:rPr>
+              <w:t>on four criteria — technical execution, scientific rigour (</w:t>
+            </w:r>
+            <w:r>
+              <w:rPr>
+                <w:rFonts w:cs="Calibri"/>
+                <w:bCs/>
+                <w:sz w:val="16"/>
+                <w:szCs w:val="16"/>
+                <w:lang w:val="en-GB"/>
+              </w:rPr>
+              <w:t xml:space="preserve">e.g. </w:t>
+            </w:r>
+            <w:r>
+              <w:rPr>
+                <w:rFonts w:cs="Calibri"/>
+                <w:bCs/>
+                <w:sz w:val="16"/>
+                <w:szCs w:val="16"/>
+                <w:lang w:val="en-GB"/>
+              </w:rPr>
+              <w:t xml:space="preserve">reporting </w:t>
+            </w:r>
+            <w:r>
+              <w:rPr>
+                <w:rFonts w:cs="Calibri"/>
+                <w:bCs/>
+                <w:sz w:val="16"/>
+                <w:szCs w:val="16"/>
+                <w:lang w:val="en-GB"/>
+              </w:rPr>
+              <w:t>even</w:t>
+            </w:r>
+            <w:r>
+              <w:rPr>
+                <w:rFonts w:cs="Calibri"/>
+                <w:bCs/>
+                <w:sz w:val="16"/>
+                <w:szCs w:val="16"/>
+                <w:lang w:val="en-GB"/>
+              </w:rPr>
+              <w:t xml:space="preserve"> negative and inconclusive results), independence </w:t>
+            </w:r>
+            <w:r>
+              <w:rPr>
+                <w:rFonts w:cs="Calibri"/>
+                <w:bCs/>
+                <w:sz w:val="16"/>
+                <w:szCs w:val="16"/>
+                <w:lang w:val="en-GB"/>
+              </w:rPr>
+              <w:t>(</w:t>
+            </w:r>
+            <w:r>
+              <w:rPr>
+                <w:rFonts w:cs="Calibri"/>
+                <w:bCs/>
+                <w:sz w:val="16"/>
+                <w:szCs w:val="16"/>
+                <w:lang w:val="en-GB"/>
+              </w:rPr>
+              <w:t>need for guidance</w:t>
+            </w:r>
+            <w:r>
+              <w:rPr>
+                <w:rFonts w:cs="Calibri"/>
+                <w:bCs/>
+                <w:sz w:val="16"/>
+                <w:szCs w:val="16"/>
+                <w:lang w:val="en-GB"/>
+              </w:rPr>
+              <w:t>]</w:t>
+            </w:r>
+            <w:r>
+              <w:rPr>
+                <w:rFonts w:cs="Calibri"/>
+                <w:bCs/>
+                <w:sz w:val="16"/>
+                <w:szCs w:val="16"/>
+                <w:lang w:val="en-GB"/>
+              </w:rPr>
+              <w:t>, and communication. Formal points at month 3 and month 6, the latter comprising a written report and an oral presentation to the group.</w:t>
+            </w:r>
           </w:p>
           <w:p>
             <w:pPr>
@@ -9598,12 +9996,12 @@
       </w:pPr>
     </w:p>
     <w:sectPr>
-      <w:headerReference w:type="even" r:id="rId12"/>
-      <w:headerReference w:type="default" r:id="rId13"/>
-      <w:footerReference w:type="even" r:id="rId14"/>
-      <w:footerReference w:type="default" r:id="rId15"/>
-      <w:headerReference w:type="first" r:id="rId16"/>
-      <w:footerReference w:type="first" r:id="rId17"/>
+      <w:headerReference w:type="even" r:id="rId14"/>
+      <w:headerReference w:type="default" r:id="rId15"/>
+      <w:footerReference w:type="even" r:id="rId16"/>
+      <w:footerReference w:type="default" r:id="rId17"/>
+      <w:headerReference w:type="first" r:id="rId18"/>
+      <w:footerReference w:type="first" r:id="rId19"/>
       <w:endnotePr>
         <w:numFmt w:val="decimal"/>
       </w:endnotePr>
@@ -11070,7 +11468,7 @@
               <v:stroke joinstyle="miter"/>
               <v:path gradientshapeok="t" o:connecttype="rect"/>
             </v:shapetype>
-            <v:shape id="Textfeld 1" o:spid="_x0000_s1026" type="#_x0000_t202" style="position:absolute;margin-left:416.55pt;margin-top:-14.2pt;width:150pt;height:60pt;z-index:-251658752;visibility:visible;mso-wrap-style:square;mso-width-percent:0;mso-height-percent:0;mso-wrap-distance-left:9pt;mso-wrap-distance-top:0;mso-wrap-distance-right:9pt;mso-wrap-distance-bottom:0;mso-position-horizontal:absolute;mso-position-horizontal-relative:text;mso-position-vertical:absolute;mso-position-vertical-relative:text;mso-width-percent:0;mso-height-percent:0;mso-width-relative:page;mso-height-relative:page;v-text-anchor:top" o:gfxdata="UEsDBBQABgAIAAAAIQC2gziS/gAAAOEBAAATAAAAW0NvbnRlbnRfVHlwZXNdLnhtbJSRQU7DMBBF&#10;90jcwfIWJU67QAgl6YK0S0CoHGBkTxKLZGx5TGhvj5O2G0SRWNoz/78nu9wcxkFMGNg6quQqL6RA&#10;0s5Y6ir5vt9lD1JwBDIwOMJKHpHlpr69KfdHjyxSmriSfYz+USnWPY7AufNIadK6MEJMx9ApD/oD&#10;OlTrorhX2lFEilmcO2RdNtjC5xDF9pCuTyYBB5bi6bQ4syoJ3g9WQ0ymaiLzg5KdCXlKLjvcW893&#10;SUOqXwnz5DrgnHtJTxOsQfEKIT7DmDSUCaxw7Rqn8787ZsmRM9e2VmPeBN4uqYvTtW7jvijg9N/y&#10;JsXecLq0q+WD6m8AAAD//wMAUEsDBBQABgAIAAAAIQA4/SH/1gAAAJQBAAALAAAAX3JlbHMvLnJl&#10;bHOkkMFqwzAMhu+DvYPRfXGawxijTi+j0GvpHsDYimMaW0Yy2fr2M4PBMnrbUb/Q94l/f/hMi1qR&#10;JVI2sOt6UJgd+ZiDgffL8ekFlFSbvV0oo4EbChzGx4f9GRdb25HMsYhqlCwG5lrLq9biZkxWOiqY&#10;22YiTra2kYMu1l1tQD30/bPm3wwYN0x18gb45AdQl1tp5j/sFB2T0FQ7R0nTNEV3j6o9feQzro1i&#10;OWA14Fm+Q8a1a8+Bvu/d/dMb2JY5uiPbhG/ktn4cqGU/er3pcvwCAAD//wMAUEsDBBQABgAIAAAA&#10;IQDVshmotgEAAG4DAAAOAAAAZHJzL2Uyb0RvYy54bWysU8Fu2zAMvQ/YPwi6L3aCtF2NOMW2IsOA&#10;YhvQ7QNkWYqFSaIgqrHz96PkNAm22zAfZFGkHvkeqc3D5Cw7qIgGfMuXi5oz5SX0xu9b/vPH7t17&#10;zjAJ3wsLXrX8qJA/bN++2YyhUSsYwPYqMgLx2Iyh5UNKoakqlINyAhcQlCenhuhEIjPuqz6KkdCd&#10;rVZ1fVuNEPsQQSpEOn2cnXxb8LVWMn3TGlVituVUWyprLGuX12q7Ec0+ijAYeSpD/EMVThhPSc9Q&#10;jyIJ9hLNX1DOyAgIOi0kuAq0NlIVDsRmWf/B5nkQQRUuJA6Gs0z4/2Dl18Nz+B5Zmj7CRA0sJDA8&#10;gfyFpE01BmxOMVlTbJCiM9FJR5f/RIHRRdL2eNZTTYnJjHZf39Q1uST57m6pX0Xw6nI7REyfFTiW&#10;Ny2P1K9SgTg8Ycr5RfMakpMhWNPvjLXFiPvuk43sIKi3u/LNd20YxHz6mg7n0IJ3hVHYzYQytTR1&#10;E+XM2w76I6liv3jS+n65XufZKcb65m5FRrz2dNce4eUANGEzEQ8fXhJoU8hckE/KUlNLTacBzFNz&#10;bZeoyzPZ/gYAAP//AwBQSwMEFAAGAAgAAAAhAAGAhd7fAAAACwEAAA8AAABkcnMvZG93bnJldi54&#10;bWxMj8FOwzAMhu9IvENkJC5oS9uhKZS6E5rggARIFLinjWk7Gqdqsq28PRkXONr+9P+fi81sB3Gg&#10;yfeOEdJlAoK4cabnFuH97WGhQPig2ejBMSF8k4dNeX5W6Ny4I7/SoQqtiCHsc43QhTDmUvqmI6v9&#10;0o3E8fbpJqtDHKdWmkkfY7gdZJYka2l1z7Gh0yNtO2q+qr2NvfezGj/qp+3usbqqd9kL98+KES8v&#10;5rtbEIHm8AfDST+qQxmdardn48WAoFarNKIIi0xdgzgR6e+qRrhJ1yDLQv7/ofwBAAD//wMAUEsB&#10;Ai0AFAAGAAgAAAAhALaDOJL+AAAA4QEAABMAAAAAAAAAAAAAAAAAAAAAAFtDb250ZW50X1R5cGVz&#10;XS54bWxQSwECLQAUAAYACAAAACEAOP0h/9YAAACUAQAACwAAAAAAAAAAAAAAAAAvAQAAX3JlbHMv&#10;LnJlbHNQSwECLQAUAAYACAAAACEA1bIZqLYBAABuAwAADgAAAAAAAAAAAAAAAAAuAgAAZHJzL2Uy&#10;b0RvYy54bWxQSwECLQAUAAYACAAAACEAAYCF3t8AAAALAQAADwAAAAAAAAAAAAAAAAAQBAAAZHJz&#10;L2Rvd25yZXYueG1sUEsFBgAAAAAEAAQA8wAAABwFAAAAAA==&#10;" o:allowincell="f" stroked="f">
+            <v:shape id="Textfeld 1" o:spid="_x0000_s1026" type="#_x0000_t202" style="position:absolute;margin-left:416.55pt;margin-top:-14.2pt;width:150pt;height:60pt;z-index:-251658752;visibility:visible;mso-wrap-style:square;mso-width-percent:0;mso-height-percent:0;mso-wrap-distance-left:9pt;mso-wrap-distance-top:0;mso-wrap-distance-right:9pt;mso-wrap-distance-bottom:0;mso-position-horizontal:absolute;mso-position-horizontal-relative:text;mso-position-vertical:absolute;mso-position-vertical-relative:text;mso-width-percent:0;mso-height-percent:0;mso-width-relative:page;mso-height-relative:page;v-text-anchor:top" o:gfxdata="UEsDBBQABgAIAAAAIQC2gziS/gAAAOEBAAATAAAAW0NvbnRlbnRfVHlwZXNdLnhtbJSRQU7DMBBF&#13;&#10;90jcwfIWJU67QAgl6YK0S0CoHGBkTxKLZGx5TGhvj5O2G0SRWNoz/78nu9wcxkFMGNg6quQqL6RA&#13;&#10;0s5Y6ir5vt9lD1JwBDIwOMJKHpHlpr69KfdHjyxSmriSfYz+USnWPY7AufNIadK6MEJMx9ApD/oD&#13;&#10;OlTrorhX2lFEilmcO2RdNtjC5xDF9pCuTyYBB5bi6bQ4syoJ3g9WQ0ymaiLzg5KdCXlKLjvcW893&#13;&#10;SUOqXwnz5DrgnHtJTxOsQfEKIT7DmDSUCaxw7Rqn8787ZsmRM9e2VmPeBN4uqYvTtW7jvijg9N/y&#13;&#10;JsXecLq0q+WD6m8AAAD//wMAUEsDBBQABgAIAAAAIQA4/SH/1gAAAJQBAAALAAAAX3JlbHMvLnJl&#13;&#10;bHOkkMFqwzAMhu+DvYPRfXGawxijTi+j0GvpHsDYimMaW0Yy2fr2M4PBMnrbUb/Q94l/f/hMi1qR&#13;&#10;JVI2sOt6UJgd+ZiDgffL8ekFlFSbvV0oo4EbChzGx4f9GRdb25HMsYhqlCwG5lrLq9biZkxWOiqY&#13;&#10;22YiTra2kYMu1l1tQD30/bPm3wwYN0x18gb45AdQl1tp5j/sFB2T0FQ7R0nTNEV3j6o9feQzro1i&#13;&#10;OWA14Fm+Q8a1a8+Bvu/d/dMb2JY5uiPbhG/ktn4cqGU/er3pcvwCAAD//wMAUEsDBBQABgAIAAAA&#13;&#10;IQDVshmotgEAAG4DAAAOAAAAZHJzL2Uyb0RvYy54bWysU8Fu2zAMvQ/YPwi6L3aCtF2NOMW2IsOA&#13;&#10;YhvQ7QNkWYqFSaIgqrHz96PkNAm22zAfZFGkHvkeqc3D5Cw7qIgGfMuXi5oz5SX0xu9b/vPH7t17&#13;&#10;zjAJ3wsLXrX8qJA/bN++2YyhUSsYwPYqMgLx2Iyh5UNKoakqlINyAhcQlCenhuhEIjPuqz6KkdCd&#13;&#10;rVZ1fVuNEPsQQSpEOn2cnXxb8LVWMn3TGlVituVUWyprLGuX12q7Ec0+ijAYeSpD/EMVThhPSc9Q&#13;&#10;jyIJ9hLNX1DOyAgIOi0kuAq0NlIVDsRmWf/B5nkQQRUuJA6Gs0z4/2Dl18Nz+B5Zmj7CRA0sJDA8&#13;&#10;gfyFpE01BmxOMVlTbJCiM9FJR5f/RIHRRdL2eNZTTYnJjHZf39Q1uST57m6pX0Xw6nI7REyfFTiW&#13;&#10;Ny2P1K9SgTg8Ycr5RfMakpMhWNPvjLXFiPvuk43sIKi3u/LNd20YxHz6mg7n0IJ3hVHYzYQytTR1&#13;&#10;E+XM2w76I6liv3jS+n65XufZKcb65m5FRrz2dNce4eUANGEzEQ8fXhJoU8hckE/KUlNLTacBzFNz&#13;&#10;bZeoyzPZ/gYAAP//AwBQSwMEFAAGAAgAAAAhABpp2uzjAAAAEAEAAA8AAABkcnMvZG93bnJldi54&#13;&#10;bWxMT01PwzAMvSPxHyIjcUFb2g5NpWs6oQEHJEBaB/e0MW1H41RNtpV/j8cFLpbs9/w+8vVke3HE&#13;&#10;0XeOFMTzCARS7UxHjYL33dMsBeGDJqN7R6jgGz2si8uLXGfGnWiLxzI0gkXIZ1pBG8KQSenrFq32&#13;&#10;czcgMfbpRqsDr2MjzahPLG57mUTRUlrdETu0esBNi/VXebDs+zilw0f1stk/lzfVPnmj7jUlpa6v&#13;&#10;pocVj/sViIBT+PuAcwfODwUHq9yBjBe9gnSxiJmqYJaktyDOjPj3VCm4i5cgi1z+L1L8AAAA//8D&#13;&#10;AFBLAQItABQABgAIAAAAIQC2gziS/gAAAOEBAAATAAAAAAAAAAAAAAAAAAAAAABbQ29udGVudF9U&#13;&#10;eXBlc10ueG1sUEsBAi0AFAAGAAgAAAAhADj9If/WAAAAlAEAAAsAAAAAAAAAAAAAAAAALwEAAF9y&#13;&#10;ZWxzLy5yZWxzUEsBAi0AFAAGAAgAAAAhANWyGai2AQAAbgMAAA4AAAAAAAAAAAAAAAAALgIAAGRy&#13;&#10;cy9lMm9Eb2MueG1sUEsBAi0AFAAGAAgAAAAhABpp2uzjAAAAEAEAAA8AAAAAAAAAAAAAAAAAEAQA&#13;&#10;AGRycy9kb3ducmV2LnhtbFBLBQYAAAAABAAEAPMAAAAgBQAAAAA=&#13;&#10;" o:allowincell="f" stroked="f">
               <v:fill opacity="0"/>
               <v:textbox>
                 <w:txbxContent>
@@ -15028,6 +15426,18 @@
       <w:vertAlign w:val="superscript"/>
     </w:rPr>
   </w:style>
+  <w:style w:type="character" w:styleId="UnresolvedMention">
+    <w:name w:val="Unresolved Mention"/>
+    <w:basedOn w:val="DefaultParagraphFont"/>
+    <w:uiPriority w:val="99"/>
+    <w:semiHidden/>
+    <w:unhideWhenUsed/>
+    <w:rsid w:val="00A221DF"/>
+    <w:rPr>
+      <w:color w:val="605E5C"/>
+      <w:shd w:val="clear" w:color="auto" w:fill="E1DFDD"/>
+    </w:rPr>
+  </w:style>
 </w:styles>
 </file>
 
@@ -15317,31 +15727,15 @@
 </file>
 
 <file path=customXml/item1.xml><?xml version="1.0" encoding="utf-8"?>
-<p:properties xmlns:p="http://schemas.microsoft.com/office/2006/metadata/properties" xmlns:xsi="http://www.w3.org/2001/XMLSchema-instance" xmlns:pc="http://schemas.microsoft.com/office/infopath/2007/PartnerControls">
-  <documentManagement>
-    <Next_x0020_date_x0020_of_x0020_delivery xmlns="cfd06d9f-862c-4359-9a69-c66ff689f26a" xsi:nil="true"/>
-    <Final_x0020_date_x0020_of_x0020_delivery xmlns="cfd06d9f-862c-4359-9a69-c66ff689f26a" xsi:nil="true"/>
-    <Leader_x0020__x0028_unit_x0029_ xmlns="cfd06d9f-862c-4359-9a69-c66ff689f26a">B1</Leader_x0020__x0028_unit_x0029_>
-    <Leader_x0020__x0028_staff_x0020_member_x0029_ xmlns="cfd06d9f-862c-4359-9a69-c66ff689f26a" xsi:nil="true"/>
-    <Year xmlns="cfd06d9f-862c-4359-9a69-c66ff689f26a">2020</Year>
-    <_x0070_gc6 xmlns="cfd06d9f-862c-4359-9a69-c66ff689f26a" xsi:nil="true"/>
-    <Document xmlns="cfd06d9f-862c-4359-9a69-c66ff689f26a">E+ Grant agreements (annexes II + charters)</Document>
-    <n7sw xmlns="cfd06d9f-862c-4359-9a69-c66ff689f26a">
-      <UserInfo>
-        <DisplayName/>
-        <AccountId xsi:nil="true"/>
-        <AccountType/>
-      </UserInfo>
-    </n7sw>
-  </documentManagement>
-</p:properties>
+<?mso-contentType ?>
+<FormTemplates xmlns="http://schemas.microsoft.com/sharepoint/v3/contenttype/forms">
+  <Display>DocumentLibraryForm</Display>
+  <Edit>DocumentLibraryForm</Edit>
+  <New>DocumentLibraryForm</New>
+</FormTemplates>
 </file>
 
 <file path=customXml/item2.xml><?xml version="1.0" encoding="utf-8"?>
-<b:Sources xmlns:b="http://schemas.openxmlformats.org/officeDocument/2006/bibliography" xmlns="http://schemas.openxmlformats.org/officeDocument/2006/bibliography" SelectedStyle="\APA.XSL" StyleName="APA"/>
-</file>
-
-<file path=customXml/item3.xml><?xml version="1.0" encoding="utf-8"?>
 <ct:contentTypeSchema xmlns:ct="http://schemas.microsoft.com/office/2006/metadata/contentType" xmlns:ma="http://schemas.microsoft.com/office/2006/metadata/properties/metaAttributes" ct:_="" ma:_="" ma:contentTypeName="EC Document" ma:contentTypeID="0x010100258AA79CEB83498886A3A0868112325000C1490CE060273747A60689B6E70012AE" ma:contentTypeVersion="14" ma:contentTypeDescription="Create a new document in this library." ma:contentTypeScope="" ma:versionID="07bc2eff7e1d96e042f6496ab490d1c4">
   <xsd:schema xmlns:xsd="http://www.w3.org/2001/XMLSchema" xmlns:xs="http://www.w3.org/2001/XMLSchema" xmlns:p="http://schemas.microsoft.com/office/2006/metadata/properties" xmlns:ns3="cfd06d9f-862c-4359-9a69-c66ff689f26a" targetNamespace="http://schemas.microsoft.com/office/2006/metadata/properties" ma:root="true" ma:fieldsID="6d7ace2b243d549d13752260e7970332" ns3:_="">
     <xsd:import namespace="cfd06d9f-862c-4359-9a69-c66ff689f26a"/>
@@ -15558,34 +15952,40 @@
 </ct:contentTypeSchema>
 </file>
 
+<file path=customXml/item3.xml><?xml version="1.0" encoding="utf-8"?>
+<b:Sources xmlns:b="http://schemas.openxmlformats.org/officeDocument/2006/bibliography" xmlns="http://schemas.openxmlformats.org/officeDocument/2006/bibliography" SelectedStyle="\APA.XSL" StyleName="APA"/>
+</file>
+
 <file path=customXml/item4.xml><?xml version="1.0" encoding="utf-8"?>
-<?mso-contentType ?>
-<FormTemplates xmlns="http://schemas.microsoft.com/sharepoint/v3/contenttype/forms">
-  <Display>DocumentLibraryForm</Display>
-  <Edit>DocumentLibraryForm</Edit>
-  <New>DocumentLibraryForm</New>
-</FormTemplates>
+<p:properties xmlns:p="http://schemas.microsoft.com/office/2006/metadata/properties" xmlns:xsi="http://www.w3.org/2001/XMLSchema-instance" xmlns:pc="http://schemas.microsoft.com/office/infopath/2007/PartnerControls">
+  <documentManagement>
+    <Next_x0020_date_x0020_of_x0020_delivery xmlns="cfd06d9f-862c-4359-9a69-c66ff689f26a" xsi:nil="true"/>
+    <Final_x0020_date_x0020_of_x0020_delivery xmlns="cfd06d9f-862c-4359-9a69-c66ff689f26a" xsi:nil="true"/>
+    <Leader_x0020__x0028_unit_x0029_ xmlns="cfd06d9f-862c-4359-9a69-c66ff689f26a">B1</Leader_x0020__x0028_unit_x0029_>
+    <Leader_x0020__x0028_staff_x0020_member_x0029_ xmlns="cfd06d9f-862c-4359-9a69-c66ff689f26a" xsi:nil="true"/>
+    <Year xmlns="cfd06d9f-862c-4359-9a69-c66ff689f26a">2020</Year>
+    <_x0070_gc6 xmlns="cfd06d9f-862c-4359-9a69-c66ff689f26a" xsi:nil="true"/>
+    <Document xmlns="cfd06d9f-862c-4359-9a69-c66ff689f26a">E+ Grant agreements (annexes II + charters)</Document>
+    <n7sw xmlns="cfd06d9f-862c-4359-9a69-c66ff689f26a">
+      <UserInfo>
+        <DisplayName/>
+        <AccountId xsi:nil="true"/>
+        <AccountType/>
+      </UserInfo>
+    </n7sw>
+  </documentManagement>
+</p:properties>
 </file>
 
 <file path=customXml/itemProps1.xml><?xml version="1.0" encoding="utf-8"?>
-<ds:datastoreItem xmlns:ds="http://schemas.openxmlformats.org/officeDocument/2006/customXml" ds:itemID="{B8E360C1-0BC0-40DA-B243-27602C084E57}">
+<ds:datastoreItem xmlns:ds="http://schemas.openxmlformats.org/officeDocument/2006/customXml" ds:itemID="{5B752834-5156-4BC0-BA44-BECE908C7555}">
   <ds:schemaRefs>
-    <ds:schemaRef ds:uri="http://schemas.microsoft.com/office/2006/metadata/properties"/>
-    <ds:schemaRef ds:uri="http://schemas.microsoft.com/office/infopath/2007/PartnerControls"/>
-    <ds:schemaRef ds:uri="cfd06d9f-862c-4359-9a69-c66ff689f26a"/>
+    <ds:schemaRef ds:uri="http://schemas.microsoft.com/sharepoint/v3/contenttype/forms"/>
   </ds:schemaRefs>
 </ds:datastoreItem>
 </file>
 
 <file path=customXml/itemProps2.xml><?xml version="1.0" encoding="utf-8"?>
-<ds:datastoreItem xmlns:ds="http://schemas.openxmlformats.org/officeDocument/2006/customXml" ds:itemID="{291A4D99-A905-4557-B2F8-66B4C1B64BCE}">
-  <ds:schemaRefs>
-    <ds:schemaRef ds:uri="http://schemas.openxmlformats.org/officeDocument/2006/bibliography"/>
-  </ds:schemaRefs>
-</ds:datastoreItem>
-</file>
-
-<file path=customXml/itemProps3.xml><?xml version="1.0" encoding="utf-8"?>
 <ds:datastoreItem xmlns:ds="http://schemas.openxmlformats.org/officeDocument/2006/customXml" ds:itemID="{E762D4B6-60EE-4984-8DDB-B3AF7AE52F59}">
   <ds:schemaRefs>
     <ds:schemaRef ds:uri="http://schemas.microsoft.com/office/2006/metadata/contentType"/>
@@ -15603,10 +16003,20 @@
 </ds:datastoreItem>
 </file>
 
+<file path=customXml/itemProps3.xml><?xml version="1.0" encoding="utf-8"?>
+<ds:datastoreItem xmlns:ds="http://schemas.openxmlformats.org/officeDocument/2006/customXml" ds:itemID="{291A4D99-A905-4557-B2F8-66B4C1B64BCE}">
+  <ds:schemaRefs>
+    <ds:schemaRef ds:uri="http://schemas.openxmlformats.org/officeDocument/2006/bibliography"/>
+  </ds:schemaRefs>
+</ds:datastoreItem>
+</file>
+
 <file path=customXml/itemProps4.xml><?xml version="1.0" encoding="utf-8"?>
-<ds:datastoreItem xmlns:ds="http://schemas.openxmlformats.org/officeDocument/2006/customXml" ds:itemID="{5B752834-5156-4BC0-BA44-BECE908C7555}">
+<ds:datastoreItem xmlns:ds="http://schemas.openxmlformats.org/officeDocument/2006/customXml" ds:itemID="{B8E360C1-0BC0-40DA-B243-27602C084E57}">
   <ds:schemaRefs>
-    <ds:schemaRef ds:uri="http://schemas.microsoft.com/sharepoint/v3/contenttype/forms"/>
+    <ds:schemaRef ds:uri="http://schemas.microsoft.com/office/2006/metadata/properties"/>
+    <ds:schemaRef ds:uri="http://schemas.microsoft.com/office/infopath/2007/PartnerControls"/>
+    <ds:schemaRef ds:uri="cfd06d9f-862c-4359-9a69-c66ff689f26a"/>
   </ds:schemaRefs>
 </ds:datastoreItem>
 </file>
</xml_diff>